<commit_message>
Actualización de declaracion del equipo
</commit_message>
<xml_diff>
--- a/docs/Declaración del equipo.docx
+++ b/docs/Declaración del equipo.docx
@@ -204,16 +204,7 @@
           <w:sz w:val="24"/>
           <w:szCs w:val="24"/>
         </w:rPr>
-        <w:t>Escobar</w:t>
-      </w:r>
-      <w:r>
-        <w:rPr>
-          <w:rFonts w:ascii="Century Gothic" w:hAnsi="Century Gothic"/>
-          <w:color w:val="000000" w:themeColor="text1"/>
-          <w:sz w:val="24"/>
-          <w:szCs w:val="24"/>
-        </w:rPr>
-        <w:t xml:space="preserve"> Bendezú, Aldrin</w:t>
+        <w:t>Escobar Bendezú, Aldrin</w:t>
       </w:r>
     </w:p>
     <w:p>
@@ -292,16 +283,7 @@
           <w:sz w:val="24"/>
           <w:szCs w:val="24"/>
         </w:rPr>
-        <w:t>Meza</w:t>
-      </w:r>
-      <w:r>
-        <w:rPr>
-          <w:rFonts w:ascii="Century Gothic" w:hAnsi="Century Gothic"/>
-          <w:color w:val="000000" w:themeColor="text1"/>
-          <w:sz w:val="24"/>
-          <w:szCs w:val="24"/>
-        </w:rPr>
-        <w:t xml:space="preserve"> Calderón, Ana Cristina</w:t>
+        <w:t>Meza Calderón, Ana Cristina</w:t>
       </w:r>
     </w:p>
     <w:p>
@@ -345,78 +327,52 @@
     </w:p>
     <w:p>
       <w:pPr>
+        <w:pStyle w:val="NormalWeb"/>
         <w:numPr>
           <w:ilvl w:val="0"/>
-          <w:numId w:val="2"/>
+          <w:numId w:val="5"/>
         </w:numPr>
-        <w:spacing w:before="100" w:beforeAutospacing="1" w:after="100" w:afterAutospacing="1" w:line="240" w:lineRule="auto"/>
-        <w:rPr>
-          <w:rFonts w:ascii="Century Gothic" w:hAnsi="Century Gothic"/>
-          <w:color w:val="000000" w:themeColor="text1"/>
-          <w:sz w:val="24"/>
-          <w:szCs w:val="24"/>
-        </w:rPr>
-      </w:pPr>
+        <w:jc w:val="both"/>
+        <w:rPr>
+          <w:rFonts w:ascii="Century Gothic" w:hAnsi="Century Gothic"/>
+        </w:rPr>
+      </w:pPr>
+      <w:r>
+        <w:rPr>
+          <w:rFonts w:ascii="Century Gothic" w:hAnsi="Century Gothic"/>
+          <w:b/>
+          <w:bCs/>
+        </w:rPr>
+        <w:t xml:space="preserve">Project Manager (Ana Cristina Meza </w:t>
+      </w:r>
       <w:proofErr w:type="spellStart"/>
       <w:r>
         <w:rPr>
-          <w:rStyle w:val="Textoennegrita"/>
-          <w:rFonts w:ascii="Century Gothic" w:hAnsi="Century Gothic"/>
-          <w:color w:val="000000" w:themeColor="text1"/>
-          <w:sz w:val="24"/>
-          <w:szCs w:val="24"/>
-        </w:rPr>
-        <w:t>Backend</w:t>
+          <w:rFonts w:ascii="Century Gothic" w:hAnsi="Century Gothic"/>
+          <w:b/>
+          <w:bCs/>
+        </w:rPr>
+        <w:t>Calderon</w:t>
       </w:r>
       <w:proofErr w:type="spellEnd"/>
       <w:r>
         <w:rPr>
-          <w:rStyle w:val="Textoennegrita"/>
-          <w:rFonts w:ascii="Century Gothic" w:hAnsi="Century Gothic"/>
-          <w:color w:val="000000" w:themeColor="text1"/>
-          <w:sz w:val="24"/>
-          <w:szCs w:val="24"/>
+          <w:rFonts w:ascii="Century Gothic" w:hAnsi="Century Gothic"/>
+          <w:b/>
+          <w:bCs/>
+        </w:rPr>
+        <w:t>):</w:t>
+      </w:r>
+      <w:r>
+        <w:rPr>
+          <w:rFonts w:ascii="Century Gothic" w:hAnsi="Century Gothic"/>
         </w:rPr>
         <w:t xml:space="preserve"> </w:t>
       </w:r>
-      <w:proofErr w:type="spellStart"/>
-      <w:r>
-        <w:rPr>
-          <w:rStyle w:val="Textoennegrita"/>
-          <w:rFonts w:ascii="Century Gothic" w:hAnsi="Century Gothic"/>
-          <w:color w:val="000000" w:themeColor="text1"/>
-          <w:sz w:val="24"/>
-          <w:szCs w:val="24"/>
-        </w:rPr>
-        <w:t>Developer</w:t>
-      </w:r>
-      <w:proofErr w:type="spellEnd"/>
-      <w:r>
-        <w:rPr>
-          <w:rStyle w:val="Textoennegrita"/>
-          <w:rFonts w:ascii="Century Gothic" w:hAnsi="Century Gothic"/>
-          <w:color w:val="000000" w:themeColor="text1"/>
-          <w:sz w:val="24"/>
-          <w:szCs w:val="24"/>
-        </w:rPr>
-        <w:t xml:space="preserve"> (Aldrin Escobar):</w:t>
-      </w:r>
-      <w:r>
-        <w:rPr>
-          <w:rFonts w:ascii="Century Gothic" w:hAnsi="Century Gothic"/>
-          <w:color w:val="000000" w:themeColor="text1"/>
-          <w:sz w:val="24"/>
-          <w:szCs w:val="24"/>
-        </w:rPr>
-        <w:br/>
-      </w:r>
       <w:proofErr w:type="gramStart"/>
       <w:r>
         <w:rPr>
           <w:rFonts w:ascii="Century Gothic" w:hAnsi="Century Gothic"/>
-          <w:color w:val="000000" w:themeColor="text1"/>
-          <w:sz w:val="24"/>
-          <w:szCs w:val="24"/>
         </w:rPr>
         <w:t>Responsable</w:t>
       </w:r>
@@ -424,129 +380,58 @@
       <w:r>
         <w:rPr>
           <w:rFonts w:ascii="Century Gothic" w:hAnsi="Century Gothic"/>
-          <w:color w:val="000000" w:themeColor="text1"/>
-          <w:sz w:val="24"/>
-          <w:szCs w:val="24"/>
-        </w:rPr>
-        <w:t xml:space="preserve"> de la lógica de negocio, modelado del problema y desarrollo de </w:t>
-      </w:r>
-      <w:proofErr w:type="spellStart"/>
-      <w:r>
-        <w:rPr>
-          <w:rFonts w:ascii="Century Gothic" w:hAnsi="Century Gothic"/>
-          <w:color w:val="000000" w:themeColor="text1"/>
-          <w:sz w:val="24"/>
-          <w:szCs w:val="24"/>
-        </w:rPr>
-        <w:t>APIs</w:t>
-      </w:r>
-      <w:proofErr w:type="spellEnd"/>
-      <w:r>
-        <w:rPr>
-          <w:rFonts w:ascii="Century Gothic" w:hAnsi="Century Gothic"/>
-          <w:color w:val="000000" w:themeColor="text1"/>
-          <w:sz w:val="24"/>
-          <w:szCs w:val="24"/>
-        </w:rPr>
-        <w:t>.</w:t>
+        </w:rPr>
+        <w:t xml:space="preserve"> de la dirección del proyecto, modelado conceptual, documentación técnica y coordinación general del equipo.</w:t>
       </w:r>
     </w:p>
     <w:p>
       <w:pPr>
+        <w:pStyle w:val="NormalWeb"/>
         <w:numPr>
           <w:ilvl w:val="0"/>
-          <w:numId w:val="2"/>
+          <w:numId w:val="5"/>
         </w:numPr>
-        <w:spacing w:before="100" w:beforeAutospacing="1" w:after="100" w:afterAutospacing="1" w:line="240" w:lineRule="auto"/>
-        <w:rPr>
-          <w:rFonts w:ascii="Century Gothic" w:hAnsi="Century Gothic"/>
-          <w:color w:val="000000" w:themeColor="text1"/>
-          <w:sz w:val="24"/>
-          <w:szCs w:val="24"/>
-        </w:rPr>
-      </w:pPr>
+        <w:jc w:val="both"/>
+        <w:rPr>
+          <w:rFonts w:ascii="Century Gothic" w:hAnsi="Century Gothic"/>
+        </w:rPr>
+      </w:pPr>
+      <w:r>
+        <w:rPr>
+          <w:rFonts w:ascii="Century Gothic" w:hAnsi="Century Gothic"/>
+          <w:b/>
+          <w:bCs/>
+        </w:rPr>
+        <w:t xml:space="preserve">Scrum Master (Aldrin Edwin Escobar </w:t>
+      </w:r>
       <w:proofErr w:type="spellStart"/>
       <w:r>
         <w:rPr>
-          <w:rStyle w:val="Textoennegrita"/>
-          <w:rFonts w:ascii="Century Gothic" w:hAnsi="Century Gothic"/>
-          <w:color w:val="000000" w:themeColor="text1"/>
-          <w:sz w:val="24"/>
-          <w:szCs w:val="24"/>
-        </w:rPr>
-        <w:t>Frontend</w:t>
+          <w:rFonts w:ascii="Century Gothic" w:hAnsi="Century Gothic"/>
+          <w:b/>
+          <w:bCs/>
+        </w:rPr>
+        <w:t>Benderú</w:t>
       </w:r>
       <w:proofErr w:type="spellEnd"/>
       <w:r>
         <w:rPr>
-          <w:rStyle w:val="Textoennegrita"/>
-          <w:rFonts w:ascii="Century Gothic" w:hAnsi="Century Gothic"/>
-          <w:color w:val="000000" w:themeColor="text1"/>
-          <w:sz w:val="24"/>
-          <w:szCs w:val="24"/>
+          <w:rFonts w:ascii="Century Gothic" w:hAnsi="Century Gothic"/>
+          <w:b/>
+          <w:bCs/>
+        </w:rPr>
+        <w:t>):</w:t>
+      </w:r>
+      <w:r>
+        <w:rPr>
+          <w:rFonts w:ascii="Century Gothic" w:hAnsi="Century Gothic"/>
         </w:rPr>
         <w:t xml:space="preserve"> </w:t>
       </w:r>
-      <w:proofErr w:type="spellStart"/>
-      <w:r>
-        <w:rPr>
-          <w:rStyle w:val="Textoennegrita"/>
-          <w:rFonts w:ascii="Century Gothic" w:hAnsi="Century Gothic"/>
-          <w:color w:val="000000" w:themeColor="text1"/>
-          <w:sz w:val="24"/>
-          <w:szCs w:val="24"/>
-        </w:rPr>
-        <w:t>Developer</w:t>
-      </w:r>
-      <w:proofErr w:type="spellEnd"/>
-      <w:r>
-        <w:rPr>
-          <w:rStyle w:val="Textoennegrita"/>
-          <w:rFonts w:ascii="Century Gothic" w:hAnsi="Century Gothic"/>
-          <w:color w:val="000000" w:themeColor="text1"/>
-          <w:sz w:val="24"/>
-          <w:szCs w:val="24"/>
-        </w:rPr>
-        <w:t xml:space="preserve"> (Axel </w:t>
-      </w:r>
-      <w:proofErr w:type="spellStart"/>
-      <w:r>
-        <w:rPr>
-          <w:rStyle w:val="Textoennegrita"/>
-          <w:rFonts w:ascii="Century Gothic" w:hAnsi="Century Gothic"/>
-          <w:color w:val="000000" w:themeColor="text1"/>
-          <w:sz w:val="24"/>
-          <w:szCs w:val="24"/>
-        </w:rPr>
-        <w:t>Lopez</w:t>
-      </w:r>
-      <w:proofErr w:type="spellEnd"/>
-      <w:r>
-        <w:rPr>
-          <w:rStyle w:val="Textoennegrita"/>
-          <w:rFonts w:ascii="Century Gothic" w:hAnsi="Century Gothic"/>
-          <w:color w:val="000000" w:themeColor="text1"/>
-          <w:sz w:val="24"/>
-          <w:szCs w:val="24"/>
-        </w:rPr>
-        <w:t>):</w:t>
-      </w:r>
-      <w:r>
-        <w:rPr>
-          <w:rFonts w:ascii="Century Gothic" w:hAnsi="Century Gothic"/>
-          <w:color w:val="000000" w:themeColor="text1"/>
-          <w:sz w:val="24"/>
-          <w:szCs w:val="24"/>
-        </w:rPr>
-        <w:br/>
-      </w:r>
       <w:proofErr w:type="gramStart"/>
       <w:r>
         <w:rPr>
           <w:rFonts w:ascii="Century Gothic" w:hAnsi="Century Gothic"/>
-          <w:color w:val="000000" w:themeColor="text1"/>
-          <w:sz w:val="24"/>
-          <w:szCs w:val="24"/>
         </w:rPr>
         <w:t>Responsable</w:t>
       </w:r>
@@ -554,53 +439,104 @@
       <w:r>
         <w:rPr>
           <w:rFonts w:ascii="Century Gothic" w:hAnsi="Century Gothic"/>
-          <w:color w:val="000000" w:themeColor="text1"/>
-          <w:sz w:val="24"/>
-          <w:szCs w:val="24"/>
-        </w:rPr>
-        <w:t xml:space="preserve"> del diseño e implementación de la interfaz de usuario.</w:t>
+        </w:rPr>
+        <w:t xml:space="preserve"> de facilitar la metodología de trabajo, asegurar el cumplimiento de los procesos ágiles y remover impedimentos del equipo.</w:t>
       </w:r>
     </w:p>
     <w:p>
       <w:pPr>
+        <w:pStyle w:val="NormalWeb"/>
         <w:numPr>
           <w:ilvl w:val="0"/>
-          <w:numId w:val="2"/>
+          <w:numId w:val="5"/>
         </w:numPr>
-        <w:spacing w:before="100" w:beforeAutospacing="1" w:after="100" w:afterAutospacing="1" w:line="240" w:lineRule="auto"/>
-        <w:rPr>
-          <w:rFonts w:ascii="Century Gothic" w:hAnsi="Century Gothic"/>
-          <w:color w:val="000000" w:themeColor="text1"/>
-          <w:sz w:val="24"/>
-          <w:szCs w:val="24"/>
-        </w:rPr>
-      </w:pPr>
-      <w:r>
-        <w:rPr>
-          <w:rStyle w:val="Textoennegrita"/>
-          <w:rFonts w:ascii="Century Gothic" w:hAnsi="Century Gothic"/>
-          <w:color w:val="000000" w:themeColor="text1"/>
-          <w:sz w:val="24"/>
-          <w:szCs w:val="24"/>
-        </w:rPr>
-        <w:t>Analista / Documentación / Integración (Cristina Meza):</w:t>
-      </w:r>
-      <w:r>
-        <w:rPr>
-          <w:rFonts w:ascii="Century Gothic" w:hAnsi="Century Gothic"/>
-          <w:color w:val="000000" w:themeColor="text1"/>
-          <w:sz w:val="24"/>
-          <w:szCs w:val="24"/>
-        </w:rPr>
-        <w:br/>
+        <w:jc w:val="both"/>
+        <w:rPr>
+          <w:rFonts w:ascii="Century Gothic" w:hAnsi="Century Gothic"/>
+        </w:rPr>
+      </w:pPr>
+      <w:proofErr w:type="spellStart"/>
+      <w:r>
+        <w:rPr>
+          <w:rFonts w:ascii="Century Gothic" w:hAnsi="Century Gothic"/>
+          <w:b/>
+          <w:bCs/>
+        </w:rPr>
+        <w:t>Frontend</w:t>
+      </w:r>
+      <w:proofErr w:type="spellEnd"/>
+      <w:r>
+        <w:rPr>
+          <w:rFonts w:ascii="Century Gothic" w:hAnsi="Century Gothic"/>
+          <w:b/>
+          <w:bCs/>
+        </w:rPr>
+        <w:t xml:space="preserve"> y </w:t>
+      </w:r>
+      <w:proofErr w:type="spellStart"/>
+      <w:r>
+        <w:rPr>
+          <w:rFonts w:ascii="Century Gothic" w:hAnsi="Century Gothic"/>
+          <w:b/>
+          <w:bCs/>
+        </w:rPr>
+        <w:t>Backend</w:t>
+      </w:r>
+      <w:proofErr w:type="spellEnd"/>
+      <w:r>
+        <w:rPr>
+          <w:rFonts w:ascii="Century Gothic" w:hAnsi="Century Gothic"/>
+          <w:b/>
+          <w:bCs/>
+        </w:rPr>
+        <w:t xml:space="preserve"> </w:t>
+      </w:r>
+      <w:proofErr w:type="spellStart"/>
+      <w:r>
+        <w:rPr>
+          <w:rFonts w:ascii="Century Gothic" w:hAnsi="Century Gothic"/>
+          <w:b/>
+          <w:bCs/>
+        </w:rPr>
+        <w:t>Developer</w:t>
+      </w:r>
+      <w:proofErr w:type="spellEnd"/>
+      <w:r>
+        <w:rPr>
+          <w:rFonts w:ascii="Century Gothic" w:hAnsi="Century Gothic"/>
+          <w:b/>
+          <w:bCs/>
+        </w:rPr>
+        <w:t xml:space="preserve"> (Axel López </w:t>
+      </w:r>
+      <w:proofErr w:type="spellStart"/>
+      <w:r>
+        <w:rPr>
+          <w:rFonts w:ascii="Century Gothic" w:hAnsi="Century Gothic"/>
+          <w:b/>
+          <w:bCs/>
+        </w:rPr>
+        <w:t>Rodriguez</w:t>
+      </w:r>
+      <w:proofErr w:type="spellEnd"/>
+      <w:r>
+        <w:rPr>
+          <w:rFonts w:ascii="Century Gothic" w:hAnsi="Century Gothic"/>
+          <w:b/>
+          <w:bCs/>
+        </w:rPr>
+        <w:t>):</w:t>
+      </w:r>
+      <w:r>
+        <w:rPr>
+          <w:rFonts w:ascii="Century Gothic" w:hAnsi="Century Gothic"/>
+        </w:rPr>
+        <w:t xml:space="preserve"> </w:t>
       </w:r>
       <w:proofErr w:type="gramStart"/>
       <w:r>
         <w:rPr>
           <w:rFonts w:ascii="Century Gothic" w:hAnsi="Century Gothic"/>
-          <w:color w:val="000000" w:themeColor="text1"/>
-          <w:sz w:val="24"/>
-          <w:szCs w:val="24"/>
         </w:rPr>
         <w:t>Responsable</w:t>
       </w:r>
@@ -608,12 +544,53 @@
       <w:r>
         <w:rPr>
           <w:rFonts w:ascii="Century Gothic" w:hAnsi="Century Gothic"/>
-          <w:color w:val="000000" w:themeColor="text1"/>
-          <w:sz w:val="24"/>
-          <w:szCs w:val="24"/>
-        </w:rPr>
-        <w:t xml:space="preserve"> del modelado conceptual, documentación técnica y coordinación de integración.</w:t>
-      </w:r>
+        </w:rPr>
+        <w:t xml:space="preserve"> de todo el desarrollo técnico; incluye el diseño e implementación de la interfaz de usuario (</w:t>
+      </w:r>
+      <w:proofErr w:type="spellStart"/>
+      <w:r>
+        <w:rPr>
+          <w:rFonts w:ascii="Century Gothic" w:hAnsi="Century Gothic"/>
+        </w:rPr>
+        <w:t>Frontend</w:t>
+      </w:r>
+      <w:proofErr w:type="spellEnd"/>
+      <w:r>
+        <w:rPr>
+          <w:rFonts w:ascii="Century Gothic" w:hAnsi="Century Gothic"/>
+        </w:rPr>
+        <w:t xml:space="preserve">), así como la lógica de negocio, modelado del problema y desarrollo de </w:t>
+      </w:r>
+      <w:proofErr w:type="spellStart"/>
+      <w:r>
+        <w:rPr>
+          <w:rFonts w:ascii="Century Gothic" w:hAnsi="Century Gothic"/>
+        </w:rPr>
+        <w:t>APIs</w:t>
+      </w:r>
+      <w:proofErr w:type="spellEnd"/>
+      <w:r>
+        <w:rPr>
+          <w:rFonts w:ascii="Century Gothic" w:hAnsi="Century Gothic"/>
+        </w:rPr>
+        <w:t xml:space="preserve"> (</w:t>
+      </w:r>
+      <w:proofErr w:type="spellStart"/>
+      <w:r>
+        <w:rPr>
+          <w:rFonts w:ascii="Century Gothic" w:hAnsi="Century Gothic"/>
+        </w:rPr>
+        <w:t>Backend</w:t>
+      </w:r>
+      <w:proofErr w:type="spellEnd"/>
+      <w:r>
+        <w:rPr>
+          <w:rFonts w:ascii="Century Gothic" w:hAnsi="Century Gothic"/>
+        </w:rPr>
+        <w:t>).</w:t>
+      </w:r>
+      <w:bookmarkStart w:id="0" w:name="_GoBack"/>
+      <w:bookmarkEnd w:id="0"/>
     </w:p>
     <w:p>
       <w:pPr>
@@ -791,8 +768,6 @@
           <w:t>https://github.com/Hannah2112-hub/TP2.git</w:t>
         </w:r>
       </w:hyperlink>
-      <w:bookmarkStart w:id="0" w:name="_GoBack"/>
-      <w:bookmarkEnd w:id="0"/>
     </w:p>
     <w:p/>
     <w:sectPr>
@@ -808,6 +783,92 @@
 <file path=word/numbering.xml><?xml version="1.0" encoding="utf-8"?>
 <w:numbering xmlns:wpc="http://schemas.microsoft.com/office/word/2010/wordprocessingCanvas" xmlns:cx="http://schemas.microsoft.com/office/drawing/2014/chartex" xmlns:cx1="http://schemas.microsoft.com/office/drawing/2015/9/8/chartex" xmlns:cx2="http://schemas.microsoft.com/office/drawing/2015/10/21/chartex" xmlns:cx3="http://schemas.microsoft.com/office/drawing/2016/5/9/chartex" xmlns:cx4="http://schemas.microsoft.com/office/drawing/2016/5/10/chartex" xmlns:cx5="http://schemas.microsoft.com/office/drawing/2016/5/11/chartex" xmlns:cx6="http://schemas.microsoft.com/office/drawing/2016/5/12/chartex" xmlns:cx7="http://schemas.microsoft.com/office/drawing/2016/5/13/chartex" xmlns:cx8="http://schemas.microsoft.com/office/drawing/2016/5/14/chartex" xmlns:mc="http://schemas.openxmlformats.org/markup-compatibility/2006" xmlns:aink="http://schemas.microsoft.com/office/drawing/2016/ink" xmlns:am3d="http://schemas.microsoft.com/office/drawing/2017/model3d" xmlns:o="urn:schemas-microsoft-com:office:office" xmlns:r="http://schemas.openxmlformats.org/officeDocument/2006/relationships" xmlns:m="http://schemas.openxmlformats.org/officeDocument/2006/math" xmlns:v="urn:schemas-microsoft-com:vml" xmlns:wp14="http://schemas.microsoft.com/office/word/2010/wordprocessingDrawing" xmlns:wp="http://schemas.openxmlformats.org/drawingml/2006/wordprocessingDrawing" xmlns:w10="urn:schemas-microsoft-com:office:word" xmlns:w="http://schemas.openxmlformats.org/wordprocessingml/2006/main" xmlns:w14="http://schemas.microsoft.com/office/word/2010/wordml" xmlns:w15="http://schemas.microsoft.com/office/word/2012/wordml" xmlns:w16cid="http://schemas.microsoft.com/office/word/2016/wordml/cid" xmlns:w16se="http://schemas.microsoft.com/office/word/2015/wordml/symex" xmlns:wpg="http://schemas.microsoft.com/office/word/2010/wordprocessingGroup" xmlns:wpi="http://schemas.microsoft.com/office/word/2010/wordprocessingInk" xmlns:wne="http://schemas.microsoft.com/office/word/2006/wordml" xmlns:wps="http://schemas.microsoft.com/office/word/2010/wordprocessingShape" mc:Ignorable="w14 w15 w16se w16cid wp14">
   <w:abstractNum w:abstractNumId="0" w15:restartNumberingAfterBreak="0">
+    <w:nsid w:val="3483502C"/>
+    <w:multiLevelType w:val="hybridMultilevel"/>
+    <w:tmpl w:val="CA524E8E"/>
+    <w:lvl w:ilvl="0" w:tplc="280A000F">
+      <w:start w:val="1"/>
+      <w:numFmt w:val="decimal"/>
+      <w:lvlText w:val="%1."/>
+      <w:lvlJc w:val="left"/>
+      <w:pPr>
+        <w:ind w:left="720" w:hanging="360"/>
+      </w:pPr>
+    </w:lvl>
+    <w:lvl w:ilvl="1" w:tplc="280A0019" w:tentative="1">
+      <w:start w:val="1"/>
+      <w:numFmt w:val="lowerLetter"/>
+      <w:lvlText w:val="%2."/>
+      <w:lvlJc w:val="left"/>
+      <w:pPr>
+        <w:ind w:left="1440" w:hanging="360"/>
+      </w:pPr>
+    </w:lvl>
+    <w:lvl w:ilvl="2" w:tplc="280A001B" w:tentative="1">
+      <w:start w:val="1"/>
+      <w:numFmt w:val="lowerRoman"/>
+      <w:lvlText w:val="%3."/>
+      <w:lvlJc w:val="right"/>
+      <w:pPr>
+        <w:ind w:left="2160" w:hanging="180"/>
+      </w:pPr>
+    </w:lvl>
+    <w:lvl w:ilvl="3" w:tplc="280A000F" w:tentative="1">
+      <w:start w:val="1"/>
+      <w:numFmt w:val="decimal"/>
+      <w:lvlText w:val="%4."/>
+      <w:lvlJc w:val="left"/>
+      <w:pPr>
+        <w:ind w:left="2880" w:hanging="360"/>
+      </w:pPr>
+    </w:lvl>
+    <w:lvl w:ilvl="4" w:tplc="280A0019" w:tentative="1">
+      <w:start w:val="1"/>
+      <w:numFmt w:val="lowerLetter"/>
+      <w:lvlText w:val="%5."/>
+      <w:lvlJc w:val="left"/>
+      <w:pPr>
+        <w:ind w:left="3600" w:hanging="360"/>
+      </w:pPr>
+    </w:lvl>
+    <w:lvl w:ilvl="5" w:tplc="280A001B" w:tentative="1">
+      <w:start w:val="1"/>
+      <w:numFmt w:val="lowerRoman"/>
+      <w:lvlText w:val="%6."/>
+      <w:lvlJc w:val="right"/>
+      <w:pPr>
+        <w:ind w:left="4320" w:hanging="180"/>
+      </w:pPr>
+    </w:lvl>
+    <w:lvl w:ilvl="6" w:tplc="280A000F" w:tentative="1">
+      <w:start w:val="1"/>
+      <w:numFmt w:val="decimal"/>
+      <w:lvlText w:val="%7."/>
+      <w:lvlJc w:val="left"/>
+      <w:pPr>
+        <w:ind w:left="5040" w:hanging="360"/>
+      </w:pPr>
+    </w:lvl>
+    <w:lvl w:ilvl="7" w:tplc="280A0019" w:tentative="1">
+      <w:start w:val="1"/>
+      <w:numFmt w:val="lowerLetter"/>
+      <w:lvlText w:val="%8."/>
+      <w:lvlJc w:val="left"/>
+      <w:pPr>
+        <w:ind w:left="5760" w:hanging="360"/>
+      </w:pPr>
+    </w:lvl>
+    <w:lvl w:ilvl="8" w:tplc="280A001B" w:tentative="1">
+      <w:start w:val="1"/>
+      <w:numFmt w:val="lowerRoman"/>
+      <w:lvlText w:val="%9."/>
+      <w:lvlJc w:val="right"/>
+      <w:pPr>
+        <w:ind w:left="6480" w:hanging="180"/>
+      </w:pPr>
+    </w:lvl>
+  </w:abstractNum>
+  <w:abstractNum w:abstractNumId="1" w15:restartNumberingAfterBreak="0">
     <w:nsid w:val="561A67F6"/>
     <w:multiLevelType w:val="multilevel"/>
     <w:tmpl w:val="0B5E8ED2"/>
@@ -956,7 +1017,7 @@
       </w:rPr>
     </w:lvl>
   </w:abstractNum>
-  <w:abstractNum w:abstractNumId="1" w15:restartNumberingAfterBreak="0">
+  <w:abstractNum w:abstractNumId="2" w15:restartNumberingAfterBreak="0">
     <w:nsid w:val="5CB01EF1"/>
     <w:multiLevelType w:val="multilevel"/>
     <w:tmpl w:val="6436E144"/>
@@ -1105,7 +1166,7 @@
       </w:rPr>
     </w:lvl>
   </w:abstractNum>
-  <w:abstractNum w:abstractNumId="2" w15:restartNumberingAfterBreak="0">
+  <w:abstractNum w:abstractNumId="3" w15:restartNumberingAfterBreak="0">
     <w:nsid w:val="5D250F38"/>
     <w:multiLevelType w:val="multilevel"/>
     <w:tmpl w:val="23525748"/>
@@ -1254,14 +1315,133 @@
       </w:rPr>
     </w:lvl>
   </w:abstractNum>
+  <w:abstractNum w:abstractNumId="4" w15:restartNumberingAfterBreak="0">
+    <w:nsid w:val="73752756"/>
+    <w:multiLevelType w:val="hybridMultilevel"/>
+    <w:tmpl w:val="8B329B06"/>
+    <w:lvl w:ilvl="0" w:tplc="280A0001">
+      <w:start w:val="1"/>
+      <w:numFmt w:val="bullet"/>
+      <w:lvlText w:val=""/>
+      <w:lvlJc w:val="left"/>
+      <w:pPr>
+        <w:ind w:left="720" w:hanging="360"/>
+      </w:pPr>
+      <w:rPr>
+        <w:rFonts w:ascii="Symbol" w:hAnsi="Symbol" w:hint="default"/>
+      </w:rPr>
+    </w:lvl>
+    <w:lvl w:ilvl="1" w:tplc="280A0003" w:tentative="1">
+      <w:start w:val="1"/>
+      <w:numFmt w:val="bullet"/>
+      <w:lvlText w:val="o"/>
+      <w:lvlJc w:val="left"/>
+      <w:pPr>
+        <w:ind w:left="1440" w:hanging="360"/>
+      </w:pPr>
+      <w:rPr>
+        <w:rFonts w:ascii="Courier New" w:hAnsi="Courier New" w:cs="Courier New" w:hint="default"/>
+      </w:rPr>
+    </w:lvl>
+    <w:lvl w:ilvl="2" w:tplc="280A0005" w:tentative="1">
+      <w:start w:val="1"/>
+      <w:numFmt w:val="bullet"/>
+      <w:lvlText w:val=""/>
+      <w:lvlJc w:val="left"/>
+      <w:pPr>
+        <w:ind w:left="2160" w:hanging="360"/>
+      </w:pPr>
+      <w:rPr>
+        <w:rFonts w:ascii="Wingdings" w:hAnsi="Wingdings" w:hint="default"/>
+      </w:rPr>
+    </w:lvl>
+    <w:lvl w:ilvl="3" w:tplc="280A0001" w:tentative="1">
+      <w:start w:val="1"/>
+      <w:numFmt w:val="bullet"/>
+      <w:lvlText w:val=""/>
+      <w:lvlJc w:val="left"/>
+      <w:pPr>
+        <w:ind w:left="2880" w:hanging="360"/>
+      </w:pPr>
+      <w:rPr>
+        <w:rFonts w:ascii="Symbol" w:hAnsi="Symbol" w:hint="default"/>
+      </w:rPr>
+    </w:lvl>
+    <w:lvl w:ilvl="4" w:tplc="280A0003" w:tentative="1">
+      <w:start w:val="1"/>
+      <w:numFmt w:val="bullet"/>
+      <w:lvlText w:val="o"/>
+      <w:lvlJc w:val="left"/>
+      <w:pPr>
+        <w:ind w:left="3600" w:hanging="360"/>
+      </w:pPr>
+      <w:rPr>
+        <w:rFonts w:ascii="Courier New" w:hAnsi="Courier New" w:cs="Courier New" w:hint="default"/>
+      </w:rPr>
+    </w:lvl>
+    <w:lvl w:ilvl="5" w:tplc="280A0005" w:tentative="1">
+      <w:start w:val="1"/>
+      <w:numFmt w:val="bullet"/>
+      <w:lvlText w:val=""/>
+      <w:lvlJc w:val="left"/>
+      <w:pPr>
+        <w:ind w:left="4320" w:hanging="360"/>
+      </w:pPr>
+      <w:rPr>
+        <w:rFonts w:ascii="Wingdings" w:hAnsi="Wingdings" w:hint="default"/>
+      </w:rPr>
+    </w:lvl>
+    <w:lvl w:ilvl="6" w:tplc="280A0001" w:tentative="1">
+      <w:start w:val="1"/>
+      <w:numFmt w:val="bullet"/>
+      <w:lvlText w:val=""/>
+      <w:lvlJc w:val="left"/>
+      <w:pPr>
+        <w:ind w:left="5040" w:hanging="360"/>
+      </w:pPr>
+      <w:rPr>
+        <w:rFonts w:ascii="Symbol" w:hAnsi="Symbol" w:hint="default"/>
+      </w:rPr>
+    </w:lvl>
+    <w:lvl w:ilvl="7" w:tplc="280A0003" w:tentative="1">
+      <w:start w:val="1"/>
+      <w:numFmt w:val="bullet"/>
+      <w:lvlText w:val="o"/>
+      <w:lvlJc w:val="left"/>
+      <w:pPr>
+        <w:ind w:left="5760" w:hanging="360"/>
+      </w:pPr>
+      <w:rPr>
+        <w:rFonts w:ascii="Courier New" w:hAnsi="Courier New" w:cs="Courier New" w:hint="default"/>
+      </w:rPr>
+    </w:lvl>
+    <w:lvl w:ilvl="8" w:tplc="280A0005" w:tentative="1">
+      <w:start w:val="1"/>
+      <w:numFmt w:val="bullet"/>
+      <w:lvlText w:val=""/>
+      <w:lvlJc w:val="left"/>
+      <w:pPr>
+        <w:ind w:left="6480" w:hanging="360"/>
+      </w:pPr>
+      <w:rPr>
+        <w:rFonts w:ascii="Wingdings" w:hAnsi="Wingdings" w:hint="default"/>
+      </w:rPr>
+    </w:lvl>
+  </w:abstractNum>
   <w:num w:numId="1">
+    <w:abstractNumId w:val="1"/>
+  </w:num>
+  <w:num w:numId="2">
+    <w:abstractNumId w:val="3"/>
+  </w:num>
+  <w:num w:numId="3">
+    <w:abstractNumId w:val="2"/>
+  </w:num>
+  <w:num w:numId="4">
     <w:abstractNumId w:val="0"/>
   </w:num>
-  <w:num w:numId="2">
-    <w:abstractNumId w:val="2"/>
-  </w:num>
-  <w:num w:numId="3">
-    <w:abstractNumId w:val="1"/>
+  <w:num w:numId="5">
+    <w:abstractNumId w:val="4"/>
   </w:num>
 </w:numbering>
 </file>
@@ -1845,6 +2025,23 @@
       <w:u w:val="single"/>
     </w:rPr>
   </w:style>
+  <w:style w:type="paragraph" w:styleId="NormalWeb">
+    <w:name w:val="Normal (Web)"/>
+    <w:basedOn w:val="Normal"/>
+    <w:uiPriority w:val="99"/>
+    <w:semiHidden/>
+    <w:unhideWhenUsed/>
+    <w:rsid w:val="00C76748"/>
+    <w:pPr>
+      <w:spacing w:before="100" w:beforeAutospacing="1" w:after="100" w:afterAutospacing="1" w:line="240" w:lineRule="auto"/>
+    </w:pPr>
+    <w:rPr>
+      <w:rFonts w:ascii="Times New Roman" w:eastAsia="Times New Roman" w:hAnsi="Times New Roman" w:cs="Times New Roman"/>
+      <w:sz w:val="24"/>
+      <w:szCs w:val="24"/>
+      <w:lang w:eastAsia="es-PE"/>
+    </w:rPr>
+  </w:style>
 </w:styles>
 </file>
 

</xml_diff>